<commit_message>
feat(commercial-pa): blank Jinja2 template from source PA document
Convert the prefilled Pontiac portfolio purchase agreement into a
reusable docxtpl template with 70 Jinja2 variables covering:
- Purchaser/Seller party info and notice addresses
- Effective date, property description, legal description
- Purchase price, payment method checkboxes (cash/mortgage/land contract)
- Land contract financial terms
- Earnest money, title company, title insurance
- 10 due diligence checkboxes with conditional [X]/[ ] rendering
- Closing timeline, broker details
- Offer expiration
- Exhibit A entity table (for-loop)
- Additional provisions (for-loop)

Co-Authored-By: Claude Opus 4.6 <noreply@anthropic.com>
</commit_message>
<xml_diff>
--- a/rrg-commercial-pa/templates/commercial_pa.docx
+++ b/rrg-commercial-pa/templates/commercial_pa.docx
@@ -10521,9 +10521,9 @@
               <w:rPr>
                 <w:rtl w:val="0"/>
               </w:rPr>
-              <w:t>{% for entity in exhibit_a_entities %}{{ entity.name }}{% if not loop.last %}</w:t>
+              <w:t>{% for entity in exhibit_a_entities %}{{ entity.name }}</w:t>
               <w:br/>
-              <w:t>{% endif %}</w:t>
+              <w:t>{% endfor %}</w:t>
             </w:r>
           </w:p>
         </w:tc>
@@ -10564,9 +10564,9 @@
               <w:rPr>
                 <w:rtl w:val="0"/>
               </w:rPr>
-              <w:t>{{ entity.address }}{% if not loop.last %}</w:t>
+              <w:t>{% for entity in exhibit_a_entities %}{{ entity.address }}</w:t>
               <w:br/>
-              <w:t>{% endif %}</w:t>
+              <w:t>{% endfor %}</w:t>
             </w:r>
           </w:p>
         </w:tc>
@@ -10607,9 +10607,9 @@
               <w:rPr>
                 <w:rtl w:val="0"/>
               </w:rPr>
-              <w:t>{{ entity.parcel_ids }}{% if not loop.last %}</w:t>
+              <w:t>{% for entity in exhibit_a_entities %}{{ entity.parcel_ids }}</w:t>
               <w:br/>
-              <w:t>{% endif %}</w:t>
+              <w:t>{% endfor %}</w:t>
             </w:r>
           </w:p>
         </w:tc>
@@ -10650,9 +10650,9 @@
               <w:rPr>
                 <w:rtl w:val="0"/>
               </w:rPr>
-              <w:t>{{ entity.legal_description }}{% if not loop.last %}</w:t>
+              <w:t>{% for entity in exhibit_a_entities %}{{ entity.legal_description }}</w:t>
               <w:br/>
-              <w:t>{% endif %}{% endfor %}</w:t>
+              <w:t>{% endfor %}</w:t>
             </w:r>
           </w:p>
         </w:tc>

</xml_diff>

<commit_message>
Move Exhibit A page break inside conditional block
The hard page break was on the signature line before Exhibit A,
outside the conditional. Now it's a separate paragraph inside the
{%p if use_exhibit_a %} block so no blank page appears when
Exhibit A is hidden.

Co-Authored-By: Claude Opus 4.6 <noreply@anthropic.com>
</commit_message>
<xml_diff>
--- a/rrg-commercial-pa/templates/commercial_pa.docx
+++ b/rrg-commercial-pa/templates/commercial_pa.docx
@@ -10202,18 +10202,21 @@
         </w:rPr>
         <w:t xml:space="preserve">Its: ___________________________________ </w:t>
       </w:r>
+      <w:r/>
+      <w:r>
+        <w:rPr>
+          <w:rtl w:val="0"/>
+        </w:rPr>
+      </w:r>
+    </w:p>
+    <w:p>
+      <w:r>
+        <w:t xml:space="preserve">{%p if use_exhibit_a %}</w:t>
+      </w:r>
+    </w:p>
+    <w:p>
       <w:r>
         <w:br w:type="page"/>
-      </w:r>
-      <w:r>
-        <w:rPr>
-          <w:rtl w:val="0"/>
-        </w:rPr>
-      </w:r>
-    </w:p>
-    <w:p>
-      <w:r>
-        <w:t xml:space="preserve">{%p if use_exhibit_a %}</w:t>
       </w:r>
     </w:p>
     <w:p>

</xml_diff>

<commit_message>
Fix Exhibit A blank page + widen County/Municipality columns
Replace <w:br type="page"/> paragraph with pageBreakBefore on the
EXHIBIT A heading — prevents double page break when signatures fill
the previous page.

Column widths: [1200, 2000, 1600, 1400, 1800, 2653] so County
(Washtenaw = 9 chars) and Municipality fit without mid-word wrapping.

Co-Authored-By: Claude Opus 4.6 <noreply@anthropic.com>
</commit_message>
<xml_diff>
--- a/rrg-commercial-pa/templates/commercial_pa.docx
+++ b/rrg-commercial-pa/templates/commercial_pa.docx
@@ -10215,11 +10215,6 @@
       </w:r>
     </w:p>
     <w:p>
-      <w:r>
-        <w:br w:type="page"/>
-      </w:r>
-    </w:p>
-    <w:p>
       <w:pPr>
         <w:pStyle w:val="Heading1"/>
         <w:widowControl w:val="0"/>
@@ -10227,6 +10222,7 @@
         <w:ind w:left="18.199996948242188" w:right="808.13720703125" w:hanging="3.4000015258789062"/>
         <w:jc w:val="center"/>
         <w:rPr/>
+        <w:pageBreakBefore w:val="1"/>
       </w:pPr>
       <w:bookmarkStart w:colFirst="0" w:colLast="0" w:name="_o70l0rdyi4ht" w:id="0"/>
       <w:bookmarkEnd w:id="0"/>
@@ -10264,12 +10260,12 @@
         <w:tblLook w:val="0600"/>
       </w:tblPr>
       <w:tblGrid>
+        <w:gridCol w:w="1200"/>
+        <w:gridCol w:w="2000"/>
+        <w:gridCol w:w="1600"/>
         <w:gridCol w:w="1400"/>
-        <w:gridCol w:w="2200"/>
-        <w:gridCol w:w="1500"/>
-        <w:gridCol w:w="1200"/>
         <w:gridCol w:w="1800"/>
-        <w:gridCol w:w="2553"/>
+        <w:gridCol w:w="2653"/>
         <w:tblGridChange w:id="0">
           <w:tblGrid>
             <w:gridCol w:w="2663.234214782715"/>
@@ -10300,7 +10296,7 @@
               <w:right w:w="100.0" w:type="dxa"/>
             </w:tcMar>
             <w:vAlign w:val="top"/>
-            <w:tcW w:w="1400" w:type="dxa"/>
+            <w:tcW w:w="1200" w:type="dxa"/>
           </w:tcPr>
           <w:p>
             <w:pPr>
@@ -10352,7 +10348,7 @@
               <w:right w:w="100.0" w:type="dxa"/>
             </w:tcMar>
             <w:vAlign w:val="top"/>
-            <w:tcW w:w="2200" w:type="dxa"/>
+            <w:tcW w:w="2000" w:type="dxa"/>
           </w:tcPr>
           <w:p>
             <w:pPr>
@@ -10404,7 +10400,7 @@
               <w:right w:w="100.0" w:type="dxa"/>
             </w:tcMar>
             <w:vAlign w:val="top"/>
-            <w:tcW w:w="1500" w:type="dxa"/>
+            <w:tcW w:w="1600" w:type="dxa"/>
           </w:tcPr>
           <w:p>
             <w:pPr>
@@ -10456,7 +10452,7 @@
               <w:right w:w="100.0" w:type="dxa"/>
             </w:tcMar>
             <w:vAlign w:val="top"/>
-            <w:tcW w:w="1200" w:type="dxa"/>
+            <w:tcW w:w="1400" w:type="dxa"/>
           </w:tcPr>
           <w:p>
             <w:pPr>
@@ -10560,7 +10556,7 @@
               <w:right w:w="100.0" w:type="dxa"/>
             </w:tcMar>
             <w:vAlign w:val="top"/>
-            <w:tcW w:w="2553" w:type="dxa"/>
+            <w:tcW w:w="2653" w:type="dxa"/>
           </w:tcPr>
           <w:p>
             <w:pPr>
@@ -10600,7 +10596,7 @@
       <w:tr>
         <w:tc>
           <w:tcPr>
-            <w:tcW w:w="1400" w:type="dxa"/>
+            <w:tcW w:w="1200" w:type="dxa"/>
           </w:tcPr>
           <w:p>
             <w:r>
@@ -10610,19 +10606,19 @@
         </w:tc>
         <w:tc>
           <w:tcPr>
-            <w:tcW w:w="2200" w:type="dxa"/>
+            <w:tcW w:w="2000" w:type="dxa"/>
           </w:tcPr>
           <w:p/>
         </w:tc>
         <w:tc>
           <w:tcPr>
-            <w:tcW w:w="1500" w:type="dxa"/>
+            <w:tcW w:w="1600" w:type="dxa"/>
           </w:tcPr>
           <w:p/>
         </w:tc>
         <w:tc>
           <w:tcPr>
-            <w:tcW w:w="1200" w:type="dxa"/>
+            <w:tcW w:w="1400" w:type="dxa"/>
           </w:tcPr>
           <w:p/>
         </w:tc>
@@ -10634,7 +10630,7 @@
         </w:tc>
         <w:tc>
           <w:tcPr>
-            <w:tcW w:w="2553" w:type="dxa"/>
+            <w:tcW w:w="2653" w:type="dxa"/>
           </w:tcPr>
           <w:p/>
         </w:tc>
@@ -10642,7 +10638,7 @@
       <w:tr>
         <w:tc>
           <w:tcPr>
-            <w:tcW w:w="1400" w:type="dxa"/>
+            <w:tcW w:w="1200" w:type="dxa"/>
           </w:tcPr>
           <w:p>
             <w:r>
@@ -10652,7 +10648,7 @@
         </w:tc>
         <w:tc>
           <w:tcPr>
-            <w:tcW w:w="2200" w:type="dxa"/>
+            <w:tcW w:w="2000" w:type="dxa"/>
           </w:tcPr>
           <w:p>
             <w:r>
@@ -10662,7 +10658,7 @@
         </w:tc>
         <w:tc>
           <w:tcPr>
-            <w:tcW w:w="1500" w:type="dxa"/>
+            <w:tcW w:w="1600" w:type="dxa"/>
           </w:tcPr>
           <w:p>
             <w:r>
@@ -10672,7 +10668,7 @@
         </w:tc>
         <w:tc>
           <w:tcPr>
-            <w:tcW w:w="1200" w:type="dxa"/>
+            <w:tcW w:w="1400" w:type="dxa"/>
           </w:tcPr>
           <w:p>
             <w:r>
@@ -10692,7 +10688,7 @@
         </w:tc>
         <w:tc>
           <w:tcPr>
-            <w:tcW w:w="2553" w:type="dxa"/>
+            <w:tcW w:w="2653" w:type="dxa"/>
           </w:tcPr>
           <w:p>
             <w:r>
@@ -10704,7 +10700,7 @@
       <w:tr>
         <w:tc>
           <w:tcPr>
-            <w:tcW w:w="1400" w:type="dxa"/>
+            <w:tcW w:w="1200" w:type="dxa"/>
           </w:tcPr>
           <w:p>
             <w:r>
@@ -10714,19 +10710,19 @@
         </w:tc>
         <w:tc>
           <w:tcPr>
-            <w:tcW w:w="2200" w:type="dxa"/>
+            <w:tcW w:w="2000" w:type="dxa"/>
           </w:tcPr>
           <w:p/>
         </w:tc>
         <w:tc>
           <w:tcPr>
-            <w:tcW w:w="1500" w:type="dxa"/>
+            <w:tcW w:w="1600" w:type="dxa"/>
           </w:tcPr>
           <w:p/>
         </w:tc>
         <w:tc>
           <w:tcPr>
-            <w:tcW w:w="1200" w:type="dxa"/>
+            <w:tcW w:w="1400" w:type="dxa"/>
           </w:tcPr>
           <w:p/>
         </w:tc>
@@ -10738,7 +10734,7 @@
         </w:tc>
         <w:tc>
           <w:tcPr>
-            <w:tcW w:w="2553" w:type="dxa"/>
+            <w:tcW w:w="2653" w:type="dxa"/>
           </w:tcPr>
           <w:p/>
         </w:tc>

</xml_diff>

<commit_message>
fix(pa): remove literal $ from template, fix double-dollar and trailing Dollars
Template had literal $ before price variables (purchase_price_number,
earnest_money_number, lc_down_payment, etc.) but LLM already includes
$ in the value. Also removed redundant "Dollars." after parenthetical.

Co-Authored-By: Claude Opus 4.6 <noreply@anthropic.com>
</commit_message>
<xml_diff>
--- a/rrg-commercial-pa/templates/commercial_pa.docx
+++ b/rrg-commercial-pa/templates/commercial_pa.docx
@@ -737,7 +737,7 @@
           <w:vertAlign w:val="baseline"/>
           <w:rtl w:val="0"/>
         </w:rPr>
-        <w:t xml:space="preserve">The purchase price ("Purchase Price") for the Property shall be {{ purchase_price_words }} (${{ purchase_price_number }}) Dollars. </w:t>
+        <w:t xml:space="preserve">The purchase price ("Purchase Price") for the Property shall be {{ purchase_price_words }} ({{ purchase_price_number }}). </w:t>
       </w:r>
       <w:r>
         <w:rPr>
@@ -1077,7 +1077,7 @@
           <w:vertAlign w:val="baseline"/>
           <w:rtl w:val="0"/>
         </w:rPr>
-        <w:t xml:space="preserve"> {% if payment_land_contract %}[X]{% else %}[ ]{% endif %} Land Contract. Purchaser shall pay the full Purchase Price, including any adjustments or prorations contained herein, to Seller at Closing pursuant to a mutually acceptable Land Contract. The Land Contract shall provide for a down payment of ${{ lc_down_payment }} at closing and payment of the balance of ${{ lc_balance }}, including interest at the rate of {{ lc_interest_rate }} percent ({{ lc_interest_rate }}%) per annum, amortized over {{ lc_amortization_years }} years, with interest to start on the closing date. A final "balloon payment" consisting of the entire unpaid principal balance and all accrued and unpaid interest will become due and payable {{ lc_balloon_months }} months after closing. </w:t>
+        <w:t xml:space="preserve"> {% if payment_land_contract %}[X]{% else %}[ ]{% endif %} Land Contract. Purchaser shall pay the full Purchase Price, including any adjustments or prorations contained herein, to Seller at Closing pursuant to a mutually acceptable Land Contract. The Land Contract shall provide for a down payment of {{ lc_down_payment }} at closing and payment of the balance of {{ lc_balance }}, including interest at the rate of {{ lc_interest_rate }} percent ({{ lc_interest_rate }}%) per annum, amortized over {{ lc_amortization_years }} years, with interest to start on the closing date. A final "balloon payment" consisting of the entire unpaid principal balance and all accrued and unpaid interest will become due and payable {{ lc_balloon_months }} months after closing. </w:t>
       </w:r>
       <w:r>
         <w:rPr>
@@ -1391,7 +1391,7 @@
           <w:vertAlign w:val="baseline"/>
           <w:rtl w:val="0"/>
         </w:rPr>
-        <w:t xml:space="preserve">earnest money deposit in the amount of {{ earnest_money_words }} (${{ earnest_money_number }}) Dollars (the "Deposit"). If Purchaser fails to deliver the Deposit timely, Purchaser shall be in default and Seller may terminate this Agreement upon notice to Purchaser. The Deposit shall be refunded to Purchaser in the event this Agreement is properly terminated by Purchaser under the terms and conditions provided for herein; retained by Seller; or applied to the Purchase Price at Closing. </w:t>
+        <w:t xml:space="preserve">earnest money deposit in the amount of {{ earnest_money_words }} ({{ earnest_money_number }}) (the "Deposit"). If Purchaser fails to deliver the Deposit timely, Purchaser shall be in default and Seller may terminate this Agreement upon notice to Purchaser. The Deposit shall be refunded to Purchaser in the event this Agreement is properly terminated by Purchaser under the terms and conditions provided for herein; retained by Seller; or applied to the Purchase Price at Closing. </w:t>
       </w:r>
       <w:r>
         <w:rPr>
@@ -5934,7 +5934,7 @@
           <w:vertAlign w:val="baseline"/>
           <w:rtl w:val="0"/>
         </w:rPr>
-        <w:t xml:space="preserve">Seller agrees to pay {{ broker_name }} a brokerage fee of ${{ broker_commission_amount }} ({{ broker_commission_pct }} of ${{ purchase_price_number }}) at closing. Additionally, the seller is represented by {{ seller_broker_name }} with {{ seller_broker_company }}, whose compensation is outlined in a separate agreement. </w:t>
+        <w:t xml:space="preserve">Seller agrees to pay {{ broker_name }} a brokerage fee of {{ broker_commission_amount }} ({{ broker_commission_pct }} of {{ purchase_price_number }}) at closing. Additionally, the seller is represented by {{ seller_broker_name }} with {{ seller_broker_company }}, whose compensation is outlined in a separate agreement. </w:t>
       </w:r>
       <w:r>
         <w:rPr>

</xml_diff>

<commit_message>
fix: remove section breaks from notices area entirely
Continuous section break still caused a gap. Removed both section
breaks in the purchaser notices area (one after Facsimile, one after
With copy to) so the notices section flows as linear text.

Co-Authored-By: Claude Opus 4.6 <noreply@anthropic.com>
</commit_message>
<xml_diff>
--- a/rrg-commercial-pa/templates/commercial_pa.docx
+++ b/rrg-commercial-pa/templates/commercial_pa.docx
@@ -4881,12 +4881,6 @@
         <w:rPr>
           <w:vertAlign w:val="baseline"/>
         </w:rPr>
-        <w:sectPr>
-          <w:type w:val="continuous"/>
-          <w:pgSz w:h="16820" w:w="11900" w:orient="portrait"/>
-          <w:pgMar w:bottom="519.0000152587891" w:top="576.600341796875" w:left="623.6000061035156" w:right="623.463134765625" w:header="0" w:footer="720"/>
-          <w:pgNumType w:start="1"/>
-        </w:sectPr>
       </w:pPr>
       <w:r>
         <w:rPr>
@@ -4947,14 +4941,6 @@
         <w:rPr>
           <w:vertAlign w:val="baseline"/>
         </w:rPr>
-        <w:sectPr>
-          <w:type w:val="continuous"/>
-          <w:pgSz w:h="16820" w:w="11900" w:orient="portrait"/>
-          <w:pgMar w:bottom="519.0000152587891" w:top="576.600341796875" w:left="626.8000030517578" w:right="7367.0001220703125" w:header="0" w:footer="720"/>
-          <w:cols w:equalWidth="0" w:num="1">
-            <w:col w:space="0" w:w="3911.7000000000003"/>
-          </w:cols>
-        </w:sectPr>
       </w:pPr>
       <w:r>
         <w:rPr>

</xml_diff>